<commit_message>
Put the logo in the body of the Word templates instead of the page header
Many viewers (phone apps, previews, Drive) do not draw images from a header, so the
logo went missing in exported reports. The letterhead now sits at the top of page 1.

Co-Authored-By: Claude Sonnet 5.5 <noreply@anthropic.com>
Claude-Session: https://claude.ai/code/session_01WpkLeYUE8AoD5BvLMCbQGD
</commit_message>
<xml_diff>
--- a/public/templates/MCT_Vorlage_Monatsbericht.docx
+++ b/public/templates/MCT_Vorlage_Monatsbericht.docx
@@ -2,6 +2,86 @@
 <file path=word/document.xml><?xml version="1.0" encoding="utf-8"?>
 <w:document xmlns:w="http://schemas.openxmlformats.org/wordprocessingml/2006/main" xmlns:r="http://schemas.openxmlformats.org/officeDocument/2006/relationships" xmlns:wp="http://schemas.openxmlformats.org/drawingml/2006/wordprocessingDrawing" xmlns:a="http://schemas.openxmlformats.org/drawingml/2006/main" xmlns:pic="http://schemas.openxmlformats.org/drawingml/2006/picture">
   <w:body>
+    <w:p>
+      <w:pPr>
+        <w:spacing w:before="0" w:after="60"/>
+        <w:jc w:val="right"/>
+      </w:pPr>
+      <w:r>
+        <w:drawing>
+          <wp:inline distT="0" distB="0" distL="0" distR="0">
+            <wp:extent cx="1836000" cy="612000"/>
+            <wp:docPr id="1" name="Logo" descr="MCT Systemhaus GmbH"/>
+            <a:graphic>
+              <a:graphicData uri="http://schemas.openxmlformats.org/drawingml/2006/picture">
+                <pic:pic>
+                  <pic:nvPicPr>
+                    <pic:cNvPr id="1" name="logo.png"/>
+                    <pic:cNvPicPr/>
+                  </pic:nvPicPr>
+                  <pic:blipFill>
+                    <a:blip r:embed="rId4"/>
+                    <a:stretch>
+                      <a:fillRect/>
+                    </a:stretch>
+                  </pic:blipFill>
+                  <pic:spPr>
+                    <a:xfrm>
+                      <a:off x="0" y="0"/>
+                      <a:ext cx="1836000" cy="612000"/>
+                    </a:xfrm>
+                    <a:prstGeom prst="rect">
+                      <a:avLst/>
+                    </a:prstGeom>
+                  </pic:spPr>
+                </pic:pic>
+              </a:graphicData>
+            </a:graphic>
+          </wp:inline>
+        </w:drawing>
+      </w:r>
+    </w:p>
+    <w:p>
+      <w:pPr>
+        <w:jc w:val="right"/>
+      </w:pPr>
+      <w:r>
+        <w:rPr>
+          <w:b/>
+          <w:color w:val="103170"/>
+          <w:sz w:val="18"/>
+          <w:szCs w:val="18"/>
+        </w:rPr>
+        <w:t xml:space="preserve">MCT Systemhaus GmbH</w:t>
+      </w:r>
+    </w:p>
+    <w:p>
+      <w:pPr>
+        <w:jc w:val="right"/>
+      </w:pPr>
+      <w:r>
+        <w:rPr>
+          <w:color w:val="6C7568"/>
+          <w:sz w:val="17"/>
+          <w:szCs w:val="17"/>
+        </w:rPr>
+        <w:t xml:space="preserve">Enderstraße 59</w:t>
+      </w:r>
+    </w:p>
+    <w:p>
+      <w:pPr>
+        <w:spacing w:before="0" w:after="360"/>
+        <w:jc w:val="right"/>
+      </w:pPr>
+      <w:r>
+        <w:rPr>
+          <w:color w:val="6C7568"/>
+          <w:sz w:val="17"/>
+          <w:szCs w:val="17"/>
+        </w:rPr>
+        <w:t xml:space="preserve">01277 Dresden</w:t>
+      </w:r>
+    </w:p>
     <w:tbl>
       <w:tblPr>
         <w:tblW w:w="9354" w:type="dxa"/>
@@ -950,10 +1030,9 @@
       </w:r>
     </w:p>
     <w:sectPr>
-      <w:headerReference w:type="default" r:id="rId2"/>
       <w:footerReference w:type="default" r:id="rId3"/>
       <w:pgSz w:w="11906" w:h="16838"/>
-      <w:pgMar w:top="2551" w:right="1134" w:bottom="1418" w:left="1418" w:header="454" w:footer="567" w:gutter="0"/>
+      <w:pgMar w:top="964" w:right="1134" w:bottom="1418" w:left="1418" w:header="454" w:footer="567" w:gutter="0"/>
     </w:sectPr>
   </w:body>
 </w:document>
@@ -1083,90 +1162,6 @@
 </w:ftr>
 </file>
 
-<file path=word/header1.xml><?xml version="1.0" encoding="utf-8"?>
-<w:hdr xmlns:w="http://schemas.openxmlformats.org/wordprocessingml/2006/main" xmlns:r="http://schemas.openxmlformats.org/officeDocument/2006/relationships" xmlns:wp="http://schemas.openxmlformats.org/drawingml/2006/wordprocessingDrawing" xmlns:a="http://schemas.openxmlformats.org/drawingml/2006/main" xmlns:pic="http://schemas.openxmlformats.org/drawingml/2006/picture">
-  <w:p>
-    <w:pPr>
-      <w:spacing w:before="0" w:after="60"/>
-      <w:jc w:val="right"/>
-    </w:pPr>
-    <w:r>
-      <w:drawing>
-        <wp:inline distT="0" distB="0" distL="0" distR="0">
-          <wp:extent cx="1836000" cy="612000"/>
-          <wp:docPr id="1" name="Logo" descr="MCT Systemhaus GmbH"/>
-          <a:graphic>
-            <a:graphicData uri="http://schemas.openxmlformats.org/drawingml/2006/picture">
-              <pic:pic>
-                <pic:nvPicPr>
-                  <pic:cNvPr id="1" name="logo.png"/>
-                  <pic:cNvPicPr/>
-                </pic:nvPicPr>
-                <pic:blipFill>
-                  <a:blip r:embed="rId1"/>
-                  <a:stretch>
-                    <a:fillRect/>
-                  </a:stretch>
-                </pic:blipFill>
-                <pic:spPr>
-                  <a:xfrm>
-                    <a:off x="0" y="0"/>
-                    <a:ext cx="1836000" cy="612000"/>
-                  </a:xfrm>
-                  <a:prstGeom prst="rect">
-                    <a:avLst/>
-                  </a:prstGeom>
-                </pic:spPr>
-              </pic:pic>
-            </a:graphicData>
-          </a:graphic>
-        </wp:inline>
-      </w:drawing>
-    </w:r>
-  </w:p>
-  <w:p>
-    <w:pPr>
-      <w:jc w:val="right"/>
-    </w:pPr>
-    <w:r>
-      <w:rPr>
-        <w:b/>
-        <w:color w:val="103170"/>
-        <w:sz w:val="18"/>
-        <w:szCs w:val="18"/>
-      </w:rPr>
-      <w:t xml:space="preserve">MCT Systemhaus GmbH</w:t>
-    </w:r>
-  </w:p>
-  <w:p>
-    <w:pPr>
-      <w:jc w:val="right"/>
-    </w:pPr>
-    <w:r>
-      <w:rPr>
-        <w:color w:val="6C7568"/>
-        <w:sz w:val="17"/>
-        <w:szCs w:val="17"/>
-      </w:rPr>
-      <w:t xml:space="preserve">Enderstraße 59</w:t>
-    </w:r>
-  </w:p>
-  <w:p>
-    <w:pPr>
-      <w:jc w:val="right"/>
-    </w:pPr>
-    <w:r>
-      <w:rPr>
-        <w:color w:val="6C7568"/>
-        <w:sz w:val="17"/>
-        <w:szCs w:val="17"/>
-      </w:rPr>
-      <w:t xml:space="preserve">01277 Dresden</w:t>
-    </w:r>
-  </w:p>
-</w:hdr>
-</file>
-
 <file path=word/styles.xml><?xml version="1.0" encoding="utf-8"?>
 <w:styles xmlns:w="http://schemas.openxmlformats.org/wordprocessingml/2006/main">
   <w:docDefaults>

</xml_diff>

<commit_message>
Order notes professionally, add customer addresses, fix footer overlap in Word exports
- src/lib/notes.ts normalizes notes however they were typed (-, *, +, •, numbers,
  indented sub-points, labels) into headings, text, bullets and sub-points; plain
  exports get uniform bullets, Word templates get notizen_zeilen with hanging indents
- Customers can have an address (customers.address, Settings form); Word reports print
  it level with the company block, with name and address on the left
- Session rows in the monthly Word template may split across pages, so long notes no
  longer run into the footer in phone viewers
- Template validator/data: kunde_adresse, kunde.adresse, notizen_zeilen

Co-Authored-By: Claude Sonnet 5.5 <noreply@anthropic.com>
Claude-Session: https://claude.ai/code/session_01WpkLeYUE8AoD5BvLMCbQGD
</commit_message>
<xml_diff>
--- a/public/templates/MCT_Vorlage_Monatsbericht.docx
+++ b/public/templates/MCT_Vorlage_Monatsbericht.docx
@@ -4,7 +4,7 @@
   <w:body>
     <w:p>
       <w:pPr>
-        <w:spacing w:before="0" w:after="60"/>
+        <w:spacing w:before="0" w:after="120"/>
         <w:jc w:val="right"/>
       </w:pPr>
       <w:r>
@@ -41,46 +41,136 @@
         </w:drawing>
       </w:r>
     </w:p>
+    <w:tbl>
+      <w:tblPr>
+        <w:tblW w:w="9354" w:type="dxa"/>
+        <w:tblBorders>
+          <w:top w:val="nil"/>
+          <w:left w:val="nil"/>
+          <w:bottom w:val="nil"/>
+          <w:right w:val="nil"/>
+          <w:insideH w:val="nil"/>
+          <w:insideV w:val="nil"/>
+        </w:tblBorders>
+        <w:tblLayout w:type="fixed"/>
+      </w:tblPr>
+      <w:tblGrid>
+        <w:gridCol w:w="5300"/>
+        <w:gridCol w:w="4054"/>
+      </w:tblGrid>
+      <w:tr>
+        <w:trPr>
+          <w:cantSplit/>
+        </w:trPr>
+        <w:tc>
+          <w:tcPr>
+            <w:tcW w:w="5300" w:type="dxa"/>
+            <w:tcMar>
+              <w:top w:w="0" w:type="dxa"/>
+              <w:left w:w="0" w:type="dxa"/>
+              <w:bottom w:w="0" w:type="dxa"/>
+              <w:right w:w="80" w:type="dxa"/>
+            </w:tcMar>
+          </w:tcPr>
+          <w:p>
+            <w:pPr>
+              <w:spacing w:before="0" w:after="20"/>
+            </w:pPr>
+            <w:r>
+              <w:rPr>
+                <w:b/>
+                <w:sz w:val="18"/>
+                <w:szCs w:val="18"/>
+              </w:rPr>
+              <w:t xml:space="preserve">{kunde.name}</w:t>
+            </w:r>
+          </w:p>
+          <w:p>
+            <w:r>
+              <w:rPr>
+                <w:sz w:val="2"/>
+                <w:szCs w:val="2"/>
+              </w:rPr>
+              <w:t xml:space="preserve">{IF kunde.adresse}</w:t>
+            </w:r>
+          </w:p>
+          <w:p>
+            <w:r>
+              <w:rPr>
+                <w:sz w:val="17"/>
+                <w:szCs w:val="17"/>
+              </w:rPr>
+              <w:t xml:space="preserve">{kunde.adresse}</w:t>
+            </w:r>
+          </w:p>
+          <w:p>
+            <w:r>
+              <w:rPr>
+                <w:sz w:val="2"/>
+                <w:szCs w:val="2"/>
+              </w:rPr>
+              <w:t xml:space="preserve">{END-IF}</w:t>
+            </w:r>
+          </w:p>
+        </w:tc>
+        <w:tc>
+          <w:tcPr>
+            <w:tcW w:w="4054" w:type="dxa"/>
+            <w:tcMar>
+              <w:top w:w="0" w:type="dxa"/>
+              <w:left w:w="80" w:type="dxa"/>
+              <w:bottom w:w="0" w:type="dxa"/>
+              <w:right w:w="0" w:type="dxa"/>
+            </w:tcMar>
+          </w:tcPr>
+          <w:p>
+            <w:pPr>
+              <w:spacing w:before="0" w:after="20"/>
+              <w:jc w:val="right"/>
+            </w:pPr>
+            <w:r>
+              <w:rPr>
+                <w:b/>
+                <w:color w:val="103170"/>
+                <w:sz w:val="18"/>
+                <w:szCs w:val="18"/>
+              </w:rPr>
+              <w:t xml:space="preserve">MCT Systemhaus GmbH</w:t>
+            </w:r>
+          </w:p>
+          <w:p>
+            <w:pPr>
+              <w:jc w:val="right"/>
+            </w:pPr>
+            <w:r>
+              <w:rPr>
+                <w:color w:val="6C7568"/>
+                <w:sz w:val="17"/>
+                <w:szCs w:val="17"/>
+              </w:rPr>
+              <w:t xml:space="preserve">Enderstraße 59</w:t>
+            </w:r>
+          </w:p>
+          <w:p>
+            <w:pPr>
+              <w:jc w:val="right"/>
+            </w:pPr>
+            <w:r>
+              <w:rPr>
+                <w:color w:val="6C7568"/>
+                <w:sz w:val="17"/>
+                <w:szCs w:val="17"/>
+              </w:rPr>
+              <w:t xml:space="preserve">01277 Dresden</w:t>
+            </w:r>
+          </w:p>
+        </w:tc>
+      </w:tr>
+    </w:tbl>
     <w:p>
       <w:pPr>
-        <w:jc w:val="right"/>
+        <w:spacing w:before="0" w:after="200"/>
       </w:pPr>
-      <w:r>
-        <w:rPr>
-          <w:b/>
-          <w:color w:val="103170"/>
-          <w:sz w:val="18"/>
-          <w:szCs w:val="18"/>
-        </w:rPr>
-        <w:t xml:space="preserve">MCT Systemhaus GmbH</w:t>
-      </w:r>
-    </w:p>
-    <w:p>
-      <w:pPr>
-        <w:jc w:val="right"/>
-      </w:pPr>
-      <w:r>
-        <w:rPr>
-          <w:color w:val="6C7568"/>
-          <w:sz w:val="17"/>
-          <w:szCs w:val="17"/>
-        </w:rPr>
-        <w:t xml:space="preserve">Enderstraße 59</w:t>
-      </w:r>
-    </w:p>
-    <w:p>
-      <w:pPr>
-        <w:spacing w:before="0" w:after="360"/>
-        <w:jc w:val="right"/>
-      </w:pPr>
-      <w:r>
-        <w:rPr>
-          <w:color w:val="6C7568"/>
-          <w:sz w:val="17"/>
-          <w:szCs w:val="17"/>
-        </w:rPr>
-        <w:t xml:space="preserve">01277 Dresden</w:t>
-      </w:r>
     </w:p>
     <w:tbl>
       <w:tblPr>
@@ -108,36 +198,11 @@
             <w:tcW w:w="5300" w:type="dxa"/>
             <w:tcMar>
               <w:top w:w="0" w:type="dxa"/>
-              <w:left w:w="0" w:type="dxa"/>
+              <w:left w:w="80" w:type="dxa"/>
               <w:bottom w:w="0" w:type="dxa"/>
               <w:right w:w="80" w:type="dxa"/>
             </w:tcMar>
           </w:tcPr>
-          <w:p>
-            <w:pPr>
-              <w:spacing w:before="0" w:after="120"/>
-            </w:pPr>
-            <w:r>
-              <w:rPr>
-                <w:u w:val="single"/>
-                <w:color w:val="6C7568"/>
-                <w:sz w:val="14"/>
-                <w:szCs w:val="14"/>
-              </w:rPr>
-              <w:t xml:space="preserve">MCT Systemhaus GmbH · Enderstraße 59 · 01277 Dresden</w:t>
-            </w:r>
-          </w:p>
-          <w:p>
-            <w:r>
-              <w:rPr>
-                <w:b/>
-                <w:sz w:val="22"/>
-                <w:szCs w:val="22"/>
-              </w:rPr>
-              <w:t xml:space="preserve">{kunde.name}</w:t>
-            </w:r>
-          </w:p>
-          <w:p/>
           <w:p/>
         </w:tc>
         <w:tc>
@@ -531,9 +596,7 @@
         </w:tc>
       </w:tr>
       <w:tr>
-        <w:trPr>
-          <w:cantSplit/>
-        </w:trPr>
+        <w:trPr/>
         <w:tc>
           <w:tcPr>
             <w:tcW w:w="560" w:type="dxa"/>
@@ -597,29 +660,169 @@
           <w:p>
             <w:r>
               <w:rPr>
+                <w:sz w:val="2"/>
+                <w:szCs w:val="2"/>
+              </w:rPr>
+              <w:t xml:space="preserve">{FOR z IN $s.notizen_zeilen}</w:t>
+            </w:r>
+          </w:p>
+          <w:p>
+            <w:r>
+              <w:rPr>
+                <w:sz w:val="2"/>
+                <w:szCs w:val="2"/>
+              </w:rPr>
+              <w:t xml:space="preserve">{IF $z.ueberschrift}</w:t>
+            </w:r>
+          </w:p>
+          <w:p>
+            <w:pPr>
+              <w:keepNext/>
+              <w:spacing w:before="100" w:after="40"/>
+            </w:pPr>
+            <w:r>
+              <w:rPr>
+                <w:b/>
+                <w:color w:val="103170"/>
                 <w:sz w:val="16"/>
                 <w:szCs w:val="16"/>
               </w:rPr>
-              <w:t xml:space="preserve">{IF $s.notizen}</w:t>
-            </w:r>
-          </w:p>
-          <w:p>
+              <w:t xml:space="preserve">{$z.text}</w:t>
+            </w:r>
+          </w:p>
+          <w:p>
+            <w:r>
+              <w:rPr>
+                <w:sz w:val="2"/>
+                <w:szCs w:val="2"/>
+              </w:rPr>
+              <w:t xml:space="preserve">{END-IF}</w:t>
+            </w:r>
+          </w:p>
+          <w:p>
+            <w:r>
+              <w:rPr>
+                <w:sz w:val="2"/>
+                <w:szCs w:val="2"/>
+              </w:rPr>
+              <w:t xml:space="preserve">{IF $z.absatz}</w:t>
+            </w:r>
+          </w:p>
+          <w:p>
+            <w:pPr>
+              <w:spacing w:before="0" w:after="60"/>
+            </w:pPr>
             <w:r>
               <w:rPr>
                 <w:color w:val="6C7568"/>
                 <w:sz w:val="16"/>
                 <w:szCs w:val="16"/>
               </w:rPr>
-              <w:t xml:space="preserve">{$s.notizen}</w:t>
-            </w:r>
-          </w:p>
-          <w:p>
-            <w:r>
-              <w:rPr>
+              <w:t xml:space="preserve">{$z.text}</w:t>
+            </w:r>
+          </w:p>
+          <w:p>
+            <w:r>
+              <w:rPr>
+                <w:sz w:val="2"/>
+                <w:szCs w:val="2"/>
+              </w:rPr>
+              <w:t xml:space="preserve">{END-IF}</w:t>
+            </w:r>
+          </w:p>
+          <w:p>
+            <w:r>
+              <w:rPr>
+                <w:sz w:val="2"/>
+                <w:szCs w:val="2"/>
+              </w:rPr>
+              <w:t xml:space="preserve">{IF $z.punkt}</w:t>
+            </w:r>
+          </w:p>
+          <w:p>
+            <w:pPr>
+              <w:spacing w:before="0" w:after="40"/>
+              <w:ind w:left="284" w:hanging="284"/>
+            </w:pPr>
+            <w:r>
+              <w:rPr>
+                <w:color w:val="6C7568"/>
                 <w:sz w:val="16"/>
                 <w:szCs w:val="16"/>
               </w:rPr>
+              <w:t xml:space="preserve">{$z.marker}</w:t>
+            </w:r>
+            <w:r>
+              <w:tab/>
+            </w:r>
+            <w:r>
+              <w:rPr>
+                <w:color w:val="6C7568"/>
+                <w:sz w:val="16"/>
+                <w:szCs w:val="16"/>
+              </w:rPr>
+              <w:t xml:space="preserve">{$z.text}</w:t>
+            </w:r>
+          </w:p>
+          <w:p>
+            <w:r>
+              <w:rPr>
+                <w:sz w:val="2"/>
+                <w:szCs w:val="2"/>
+              </w:rPr>
               <w:t xml:space="preserve">{END-IF}</w:t>
+            </w:r>
+          </w:p>
+          <w:p>
+            <w:r>
+              <w:rPr>
+                <w:sz w:val="2"/>
+                <w:szCs w:val="2"/>
+              </w:rPr>
+              <w:t xml:space="preserve">{IF $z.unterpunkt}</w:t>
+            </w:r>
+          </w:p>
+          <w:p>
+            <w:pPr>
+              <w:spacing w:before="0" w:after="40"/>
+              <w:ind w:left="568" w:hanging="284"/>
+            </w:pPr>
+            <w:r>
+              <w:rPr>
+                <w:color w:val="6C7568"/>
+                <w:sz w:val="16"/>
+                <w:szCs w:val="16"/>
+              </w:rPr>
+              <w:t xml:space="preserve">{$z.marker}</w:t>
+            </w:r>
+            <w:r>
+              <w:tab/>
+            </w:r>
+            <w:r>
+              <w:rPr>
+                <w:color w:val="6C7568"/>
+                <w:sz w:val="16"/>
+                <w:szCs w:val="16"/>
+              </w:rPr>
+              <w:t xml:space="preserve">{$z.text}</w:t>
+            </w:r>
+          </w:p>
+          <w:p>
+            <w:r>
+              <w:rPr>
+                <w:sz w:val="2"/>
+                <w:szCs w:val="2"/>
+              </w:rPr>
+              <w:t xml:space="preserve">{END-IF}</w:t>
+            </w:r>
+          </w:p>
+          <w:p>
+            <w:r>
+              <w:rPr>
+                <w:sz w:val="2"/>
+                <w:szCs w:val="2"/>
+              </w:rPr>
+              <w:t xml:space="preserve">{END-FOR z}</w:t>
             </w:r>
           </w:p>
           <w:p>

</xml_diff>